<commit_message>
fim da lista 8
</commit_message>
<xml_diff>
--- a/CienciasDaComputação/Quarto Semestre/IA/Listas/Lista 8/Lista 8.docx
+++ b/CienciasDaComputação/Quarto Semestre/IA/Listas/Lista 8/Lista 8.docx
@@ -144,7 +144,6 @@
         </w:rPr>
         <w:t xml:space="preserve">Código do </w:t>
       </w:r>
-      <w:proofErr w:type="spellStart"/>
       <w:r>
         <w:rPr>
           <w:b/>
@@ -152,9 +151,8 @@
           <w:sz w:val="28"/>
           <w:szCs w:val="28"/>
         </w:rPr>
-        <w:t>repositorio</w:t>
-      </w:r>
-      <w:proofErr w:type="spellEnd"/>
+        <w:t>repositório</w:t>
+      </w:r>
       <w:r>
         <w:rPr>
           <w:b/>
@@ -209,21 +207,7 @@
             <w:rStyle w:val="Hyperlink"/>
             <w:noProof/>
           </w:rPr>
-          <w:t>https://github.com/cauacostaalves/PUCMG/tree/82e8c53aee366ec2b6d542a2a9da338c961937e1/Cienci</w:t>
-        </w:r>
-        <w:r>
-          <w:rPr>
-            <w:rStyle w:val="Hyperlink"/>
-            <w:noProof/>
-          </w:rPr>
-          <w:t>a</w:t>
-        </w:r>
-        <w:r>
-          <w:rPr>
-            <w:rStyle w:val="Hyperlink"/>
-            <w:noProof/>
-          </w:rPr>
-          <w:t>sDaComputa%C3%A7%C3%A3o/Quarto%20Semestre/IA/Listas/Lista%208</w:t>
+          <w:t>https://github.com/cauacostaalves/PUCMG/tree/82e8c53aee366ec2b6d542a2a9da338c961937e1/CienciasDaComputa%C3%A7%C3%A3o/Quarto%20Semestre/IA/Listas/Lista%208</w:t>
         </w:r>
       </w:hyperlink>
     </w:p>
@@ -284,6 +268,77 @@
           <w:noProof/>
         </w:rPr>
       </w:pPr>
+      <w:r>
+        <w:rPr>
+          <w:b/>
+          <w:noProof/>
+        </w:rPr>
+        <w:drawing>
+          <wp:inline distT="0" distB="0" distL="0" distR="0" wp14:anchorId="4FB5B927" wp14:editId="26EE3803">
+            <wp:extent cx="4916170" cy="5747385"/>
+            <wp:effectExtent l="0" t="0" r="0" b="0"/>
+            <wp:docPr id="1" name="Imagem 2" descr="Diagrama&#10;&#10;O conteúdo gerado por IA pode estar incorreto."/>
+            <wp:cNvGraphicFramePr>
+              <a:graphicFrameLocks xmlns:a="http://schemas.openxmlformats.org/drawingml/2006/main" noChangeAspect="1"/>
+            </wp:cNvGraphicFramePr>
+            <a:graphic xmlns:a="http://schemas.openxmlformats.org/drawingml/2006/main">
+              <a:graphicData uri="http://schemas.openxmlformats.org/drawingml/2006/picture">
+                <pic:pic xmlns:pic="http://schemas.openxmlformats.org/drawingml/2006/picture">
+                  <pic:nvPicPr>
+                    <pic:cNvPr id="0" name="Imagem 1" descr="Diagrama&#10;&#10;O conteúdo gerado por IA pode estar incorreto."/>
+                    <pic:cNvPicPr>
+                      <a:picLocks noChangeAspect="1" noChangeArrowheads="1"/>
+                    </pic:cNvPicPr>
+                  </pic:nvPicPr>
+                  <pic:blipFill>
+                    <a:blip r:embed="rId6">
+                      <a:extLst>
+                        <a:ext uri="{28A0092B-C50C-407E-A947-70E740481C1C}">
+                          <a14:useLocalDpi xmlns:a14="http://schemas.microsoft.com/office/drawing/2010/main" val="0"/>
+                        </a:ext>
+                      </a:extLst>
+                    </a:blip>
+                    <a:srcRect/>
+                    <a:stretch>
+                      <a:fillRect/>
+                    </a:stretch>
+                  </pic:blipFill>
+                  <pic:spPr bwMode="auto">
+                    <a:xfrm>
+                      <a:off x="0" y="0"/>
+                      <a:ext cx="4916170" cy="5747385"/>
+                    </a:xfrm>
+                    <a:prstGeom prst="rect">
+                      <a:avLst/>
+                    </a:prstGeom>
+                    <a:noFill/>
+                    <a:ln>
+                      <a:noFill/>
+                    </a:ln>
+                  </pic:spPr>
+                </pic:pic>
+              </a:graphicData>
+            </a:graphic>
+          </wp:inline>
+        </w:drawing>
+      </w:r>
+    </w:p>
+    <w:p>
+      <w:pPr>
+        <w:rPr>
+          <w:b/>
+          <w:bCs/>
+          <w:noProof/>
+        </w:rPr>
+      </w:pPr>
+      <w:r>
+        <w:rPr>
+          <w:b/>
+          <w:bCs/>
+          <w:noProof/>
+        </w:rPr>
+        <w:t>Peso sera de 64.</w:t>
+      </w:r>
     </w:p>
     <w:p>
       <w:pPr>
@@ -304,6 +359,7 @@
           <w:sz w:val="28"/>
           <w:szCs w:val="28"/>
         </w:rPr>
+        <w:lastRenderedPageBreak/>
         <w:t xml:space="preserve">3 </w:t>
       </w:r>
       <w:r>
@@ -325,8 +381,463 @@
         <w:t>Relatório</w:t>
       </w:r>
     </w:p>
+    <w:p>
+      <w:pPr>
+        <w:rPr>
+          <w:b/>
+          <w:bCs/>
+        </w:rPr>
+      </w:pPr>
+      <w:r>
+        <w:rPr>
+          <w:b/>
+          <w:bCs/>
+        </w:rPr>
+        <w:t>Arquitetura</w:t>
+      </w:r>
+    </w:p>
+    <w:p>
+      <w:pPr>
+        <w:pStyle w:val="PargrafodaLista"/>
+        <w:numPr>
+          <w:ilvl w:val="0"/>
+          <w:numId w:val="2"/>
+        </w:numPr>
+      </w:pPr>
+      <w:r>
+        <w:t xml:space="preserve">Entrada: 7 segmentos binários </w:t>
+      </w:r>
+    </w:p>
+    <w:p>
+      <w:pPr>
+        <w:pStyle w:val="PargrafodaLista"/>
+        <w:numPr>
+          <w:ilvl w:val="0"/>
+          <w:numId w:val="2"/>
+        </w:numPr>
+      </w:pPr>
+      <w:r>
+        <w:t>Camada oculta: 5 neurônios</w:t>
+      </w:r>
+    </w:p>
+    <w:p>
+      <w:pPr>
+        <w:pStyle w:val="PargrafodaLista"/>
+        <w:numPr>
+          <w:ilvl w:val="0"/>
+          <w:numId w:val="2"/>
+        </w:numPr>
+      </w:pPr>
+      <w:r>
+        <w:t>Saída: 4 neurônios (one-hot)</w:t>
+      </w:r>
+    </w:p>
+    <w:p>
+      <w:pPr>
+        <w:pStyle w:val="PargrafodaLista"/>
+        <w:numPr>
+          <w:ilvl w:val="0"/>
+          <w:numId w:val="2"/>
+        </w:numPr>
+      </w:pPr>
+      <w:r>
+        <w:t xml:space="preserve">Função de ativação: Sigmoide </w:t>
+      </w:r>
+      <w:r>
+        <w:t>(1 / 1+e^-x)</w:t>
+      </w:r>
+    </w:p>
+    <w:p>
+      <w:pPr>
+        <w:rPr>
+          <w:b/>
+          <w:bCs/>
+        </w:rPr>
+      </w:pPr>
+      <w:r>
+        <w:rPr>
+          <w:b/>
+          <w:bCs/>
+        </w:rPr>
+        <w:t>Robustez</w:t>
+      </w:r>
+    </w:p>
+    <w:p>
+      <w:pPr>
+        <w:pStyle w:val="PargrafodaLista"/>
+        <w:numPr>
+          <w:ilvl w:val="0"/>
+          <w:numId w:val="3"/>
+        </w:numPr>
+      </w:pPr>
+      <w:r>
+        <w:t>Ruído gaussiano adicionado às entradas</w:t>
+      </w:r>
+    </w:p>
+    <w:p>
+      <w:pPr>
+        <w:pStyle w:val="PargrafodaLista"/>
+        <w:numPr>
+          <w:ilvl w:val="0"/>
+          <w:numId w:val="3"/>
+        </w:numPr>
+      </w:pPr>
+      <w:r>
+        <w:t xml:space="preserve">Comparação de erro sem e com ruído </w:t>
+      </w:r>
+    </w:p>
+    <w:p>
+      <w:pPr>
+        <w:rPr>
+          <w:b/>
+          <w:bCs/>
+        </w:rPr>
+      </w:pPr>
+      <w:r>
+        <w:rPr>
+          <w:b/>
+          <w:bCs/>
+        </w:rPr>
+        <w:t>Resultados</w:t>
+      </w:r>
+    </w:p>
+    <w:p>
+      <w:pPr>
+        <w:pStyle w:val="PargrafodaLista"/>
+        <w:numPr>
+          <w:ilvl w:val="0"/>
+          <w:numId w:val="4"/>
+        </w:numPr>
+      </w:pPr>
+      <w:r>
+        <w:t>Erro final sem ruído: 0.009552</w:t>
+      </w:r>
+    </w:p>
+    <w:p>
+      <w:pPr>
+        <w:pStyle w:val="PargrafodaLista"/>
+        <w:numPr>
+          <w:ilvl w:val="0"/>
+          <w:numId w:val="4"/>
+        </w:numPr>
+      </w:pPr>
+      <w:r>
+        <w:t xml:space="preserve">Erro com ruído: 0.018029 </w:t>
+      </w:r>
+    </w:p>
+    <w:p>
+      <w:pPr>
+        <w:pStyle w:val="PargrafodaLista"/>
+      </w:pPr>
+    </w:p>
+    <w:p>
+      <w:r>
+        <w:t>Entradas originais:</w:t>
+      </w:r>
+      <w:r>
+        <w:br/>
+      </w:r>
+      <w:r>
+        <w:t>[</w:t>
+      </w:r>
+      <w:r>
+        <w:t xml:space="preserve"> </w:t>
+      </w:r>
+      <w:r>
+        <w:t>[1 1 1 1 1 1 0]</w:t>
+      </w:r>
+      <w:r>
+        <w:br/>
+      </w:r>
+      <w:r>
+        <w:t>[0 1 1 0 0 0 0]</w:t>
+      </w:r>
+      <w:r>
+        <w:br/>
+      </w:r>
+      <w:r>
+        <w:t>[1 1 0 1 1 0 1]</w:t>
+      </w:r>
+      <w:r>
+        <w:br/>
+      </w:r>
+      <w:r>
+        <w:t>[1 1 1 1 0 0 1]</w:t>
+      </w:r>
+      <w:r>
+        <w:br/>
+      </w:r>
+      <w:r>
+        <w:t>[0 1 1 0 0 1 1]</w:t>
+      </w:r>
+      <w:r>
+        <w:br/>
+      </w:r>
+      <w:r>
+        <w:t>[1 0 1 1 0 1 1]</w:t>
+      </w:r>
+      <w:r>
+        <w:br/>
+      </w:r>
+      <w:r>
+        <w:t>[1 0 1 1 1 1 1]</w:t>
+      </w:r>
+      <w:r>
+        <w:br/>
+      </w:r>
+      <w:r>
+        <w:t xml:space="preserve">[1 1 1 0 0 0 0] </w:t>
+      </w:r>
+      <w:r>
+        <w:br/>
+      </w:r>
+      <w:r>
+        <w:t xml:space="preserve">[1 1 1 1 1 1 1] </w:t>
+      </w:r>
+      <w:r>
+        <w:br/>
+      </w:r>
+      <w:r>
+        <w:t>[1 1 1 1 0 1 1]</w:t>
+      </w:r>
+      <w:r>
+        <w:t xml:space="preserve"> </w:t>
+      </w:r>
+      <w:r>
+        <w:t xml:space="preserve">] </w:t>
+      </w:r>
+    </w:p>
     <w:p/>
+    <w:p>
+      <w:r>
+        <w:t>Saídas da rede:</w:t>
+      </w:r>
+      <w:r>
+        <w:br/>
+      </w:r>
+      <w:r>
+        <w:t>[</w:t>
+      </w:r>
+      <w:r>
+        <w:t xml:space="preserve"> </w:t>
+      </w:r>
+      <w:r>
+        <w:t xml:space="preserve">[0.92 0.09 0.04 0. ] </w:t>
+      </w:r>
+      <w:r>
+        <w:br/>
+      </w:r>
+      <w:r>
+        <w:t xml:space="preserve">[0.09 0.8 0. 0.08] </w:t>
+      </w:r>
+      <w:r>
+        <w:br/>
+      </w:r>
+      <w:r>
+        <w:t xml:space="preserve">[0.06 0. 0.92 0.09] </w:t>
+      </w:r>
+      <w:r>
+        <w:br/>
+      </w:r>
+      <w:r>
+        <w:t xml:space="preserve">[0.01 0.17 0.01 0.9] </w:t>
+      </w:r>
+      <w:r>
+        <w:br/>
+      </w:r>
+      <w:r>
+        <w:t xml:space="preserve">[0.91 0.15 0.03 0. ] </w:t>
+      </w:r>
+      <w:r>
+        <w:br/>
+      </w:r>
+      <w:r>
+        <w:t xml:space="preserve">[0.01 0.93 0.13 0.07] </w:t>
+      </w:r>
+      <w:r>
+        <w:br/>
+      </w:r>
+      <w:r>
+        <w:t xml:space="preserve">[0.09 0.09 0.8 0. ] </w:t>
+      </w:r>
+      <w:r>
+        <w:br/>
+      </w:r>
+      <w:r>
+        <w:t xml:space="preserve">[0.01 0.16 0.01 0.89] </w:t>
+      </w:r>
+      <w:r>
+        <w:br/>
+      </w:r>
+      <w:r>
+        <w:t>[0.88 0.02 0.16 0</w:t>
+      </w:r>
+      <w:r>
+        <w:t>.]</w:t>
+      </w:r>
+      <w:r>
+        <w:t xml:space="preserve"> </w:t>
+      </w:r>
+      <w:r>
+        <w:br/>
+      </w:r>
+      <w:r>
+        <w:t>[0.09 0.79 0.01 0.08]</w:t>
+      </w:r>
+      <w:r>
+        <w:t xml:space="preserve"> </w:t>
+      </w:r>
+      <w:r>
+        <w:t>]</w:t>
+      </w:r>
+    </w:p>
     <w:p/>
+    <w:p>
+      <w:r>
+        <w:t xml:space="preserve"> Entradas com ruído: </w:t>
+      </w:r>
+      <w:r>
+        <w:br/>
+      </w:r>
+      <w:r>
+        <w:t>[</w:t>
+      </w:r>
+      <w:r>
+        <w:t xml:space="preserve"> </w:t>
+      </w:r>
+      <w:r>
+        <w:t xml:space="preserve">[ 1.09 0.99 1.03 1.03 1.05 1.03 0.11] </w:t>
+      </w:r>
+      <w:r>
+        <w:br/>
+      </w:r>
+      <w:r>
+        <w:t xml:space="preserve">[-0.02 1.09 1.05 0.03 0.2 0.21 -0.04] </w:t>
+      </w:r>
+      <w:r>
+        <w:br/>
+      </w:r>
+      <w:r>
+        <w:t xml:space="preserve">[ 1. 1.2 0.04 0.93 0.94 -0.07 1.06] </w:t>
+      </w:r>
+      <w:r>
+        <w:br/>
+      </w:r>
+      <w:r>
+        <w:t xml:space="preserve">[ 0.9 1.01 1.08 0.93 -0.01 0.01 1.02] </w:t>
+      </w:r>
+      <w:r>
+        <w:br/>
+      </w:r>
+      <w:r>
+        <w:t xml:space="preserve">[ 0.05 1.04 1.07 -0.13 0.11 1.08 0.95] </w:t>
+      </w:r>
+      <w:r>
+        <w:br/>
+      </w:r>
+      <w:r>
+        <w:t xml:space="preserve">[ 1.06 -0.01 0.86 0.82 -0.18 1.02 1.08] </w:t>
+      </w:r>
+      <w:r>
+        <w:br/>
+      </w:r>
+      <w:r>
+        <w:t xml:space="preserve">[ 1.15 -0.02 0.94 1.04 1.11 1.08 0.91] </w:t>
+      </w:r>
+      <w:r>
+        <w:br/>
+      </w:r>
+      <w:r>
+        <w:t xml:space="preserve">[ 1.03 1.1 1.18 -0.05 -0. 0.21 0.04] </w:t>
+      </w:r>
+      <w:r>
+        <w:br/>
+      </w:r>
+      <w:r>
+        <w:t xml:space="preserve">[ 0.89 1.03 1.02 1.13 1.09 1.07 0.82] </w:t>
+      </w:r>
+      <w:r>
+        <w:br/>
+      </w:r>
+      <w:r>
+        <w:t>[ 0.98 1.04 0.98 1.03 -0. 1.1 1. ]</w:t>
+      </w:r>
+      <w:r>
+        <w:t xml:space="preserve"> </w:t>
+      </w:r>
+      <w:r>
+        <w:t xml:space="preserve">] </w:t>
+      </w:r>
+    </w:p>
+    <w:p/>
+    <w:p>
+      <w:r>
+        <w:t xml:space="preserve">Saídas com ruído: </w:t>
+      </w:r>
+      <w:r>
+        <w:br/>
+      </w:r>
+      <w:r>
+        <w:t>[ [0.957 0.030 0.006 0.0001]</w:t>
+      </w:r>
+      <w:r>
+        <w:br/>
+      </w:r>
+      <w:r>
+        <w:t>[0.017 0.974 0.0002 0.043]</w:t>
+      </w:r>
+      <w:r>
+        <w:br/>
+      </w:r>
+      <w:r>
+        <w:t>[0.014 0.000006 0.933 0.040]</w:t>
+      </w:r>
+      <w:r>
+        <w:br/>
+      </w:r>
+      <w:r>
+        <w:t>[0.00001 0.052 0.023 0.948]</w:t>
+      </w:r>
+      <w:r>
+        <w:br/>
+      </w:r>
+      <w:r>
+        <w:t>[0.957 0.043 0.005 0.00008]</w:t>
+      </w:r>
+      <w:r>
+        <w:br/>
+      </w:r>
+      <w:r>
+        <w:t>[0.008 0.947 0.001 0.075]</w:t>
+      </w:r>
+      <w:r>
+        <w:br/>
+      </w:r>
+      <w:r>
+        <w:t>[0.191 0.00005 0.950 0.007]</w:t>
+      </w:r>
+      <w:r>
+        <w:br/>
+      </w:r>
+      <w:r>
+        <w:t>[0.00001 0.029 0.024 0.946]</w:t>
+      </w:r>
+      <w:r>
+        <w:br/>
+      </w:r>
+      <w:r>
+        <w:t>[0.962 0.004 0.072 0.00007]</w:t>
+      </w:r>
+      <w:r>
+        <w:br/>
+      </w:r>
+      <w:r>
+        <w:t>[0.056 0.953 0.00026 0.013] ]</w:t>
+      </w:r>
+      <w:r>
+        <w:t>1</w:t>
+      </w:r>
+    </w:p>
     <w:sectPr>
       <w:pgSz w:w="11906" w:h="16838"/>
       <w:pgMar w:top="1417" w:right="1701" w:bottom="1417" w:left="1701" w:header="708" w:footer="708" w:gutter="0"/>
@@ -340,6 +851,232 @@
 <file path=word/numbering.xml><?xml version="1.0" encoding="utf-8"?>
 <w:numbering xmlns:wpc="http://schemas.microsoft.com/office/word/2010/wordprocessingCanvas" xmlns:cx="http://schemas.microsoft.com/office/drawing/2014/chartex" xmlns:cx1="http://schemas.microsoft.com/office/drawing/2015/9/8/chartex" xmlns:cx2="http://schemas.microsoft.com/office/drawing/2015/10/21/chartex" xmlns:cx3="http://schemas.microsoft.com/office/drawing/2016/5/9/chartex" xmlns:cx4="http://schemas.microsoft.com/office/drawing/2016/5/10/chartex" xmlns:cx5="http://schemas.microsoft.com/office/drawing/2016/5/11/chartex" xmlns:cx6="http://schemas.microsoft.com/office/drawing/2016/5/12/chartex" xmlns:cx7="http://schemas.microsoft.com/office/drawing/2016/5/13/chartex" xmlns:cx8="http://schemas.microsoft.com/office/drawing/2016/5/14/chartex" xmlns:mc="http://schemas.openxmlformats.org/markup-compatibility/2006" xmlns:aink="http://schemas.microsoft.com/office/drawing/2016/ink" xmlns:am3d="http://schemas.microsoft.com/office/drawing/2017/model3d" xmlns:o="urn:schemas-microsoft-com:office:office" xmlns:oel="http://schemas.microsoft.com/office/2019/extlst" xmlns:r="http://schemas.openxmlformats.org/officeDocument/2006/relationships" xmlns:m="http://schemas.openxmlformats.org/officeDocument/2006/math" xmlns:v="urn:schemas-microsoft-com:vml" xmlns:wp14="http://schemas.microsoft.com/office/word/2010/wordprocessingDrawing" xmlns:wp="http://schemas.openxmlformats.org/drawingml/2006/wordprocessingDrawing" xmlns:w10="urn:schemas-microsoft-com:office:word" xmlns:w="http://schemas.openxmlformats.org/wordprocessingml/2006/main" xmlns:w14="http://schemas.microsoft.com/office/word/2010/wordml" xmlns:w15="http://schemas.microsoft.com/office/word/2012/wordml" xmlns:w16cex="http://schemas.microsoft.com/office/word/2018/wordml/cex" xmlns:w16cid="http://schemas.microsoft.com/office/word/2016/wordml/cid" xmlns:w16="http://schemas.microsoft.com/office/word/2018/wordml" xmlns:w16du="http://schemas.microsoft.com/office/word/2023/wordml/word16du" xmlns:w16sdtdh="http://schemas.microsoft.com/office/word/2020/wordml/sdtdatahash" xmlns:w16sdtfl="http://schemas.microsoft.com/office/word/2024/wordml/sdtformatlock" xmlns:w16se="http://schemas.microsoft.com/office/word/2015/wordml/symex" xmlns:wpg="http://schemas.microsoft.com/office/word/2010/wordprocessingGroup" xmlns:wpi="http://schemas.microsoft.com/office/word/2010/wordprocessingInk" xmlns:wne="http://schemas.microsoft.com/office/word/2006/wordml" xmlns:wps="http://schemas.microsoft.com/office/word/2010/wordprocessingShape" mc:Ignorable="w14 w15 w16se w16cid w16 w16cex w16sdtdh w16sdtfl w16du wp14">
   <w:abstractNum w:abstractNumId="0" w15:restartNumberingAfterBreak="0">
+    <w:nsid w:val="1EE444D7"/>
+    <w:multiLevelType w:val="hybridMultilevel"/>
+    <w:tmpl w:val="4EA210C6"/>
+    <w:lvl w:ilvl="0" w:tplc="04160001">
+      <w:start w:val="1"/>
+      <w:numFmt w:val="bullet"/>
+      <w:lvlText w:val=""/>
+      <w:lvlJc w:val="left"/>
+      <w:pPr>
+        <w:ind w:left="720" w:hanging="360"/>
+      </w:pPr>
+      <w:rPr>
+        <w:rFonts w:ascii="Symbol" w:hAnsi="Symbol" w:hint="default"/>
+      </w:rPr>
+    </w:lvl>
+    <w:lvl w:ilvl="1" w:tplc="04160003" w:tentative="1">
+      <w:start w:val="1"/>
+      <w:numFmt w:val="bullet"/>
+      <w:lvlText w:val="o"/>
+      <w:lvlJc w:val="left"/>
+      <w:pPr>
+        <w:ind w:left="1440" w:hanging="360"/>
+      </w:pPr>
+      <w:rPr>
+        <w:rFonts w:ascii="Courier New" w:hAnsi="Courier New" w:cs="Courier New" w:hint="default"/>
+      </w:rPr>
+    </w:lvl>
+    <w:lvl w:ilvl="2" w:tplc="04160005" w:tentative="1">
+      <w:start w:val="1"/>
+      <w:numFmt w:val="bullet"/>
+      <w:lvlText w:val=""/>
+      <w:lvlJc w:val="left"/>
+      <w:pPr>
+        <w:ind w:left="2160" w:hanging="360"/>
+      </w:pPr>
+      <w:rPr>
+        <w:rFonts w:ascii="Wingdings" w:hAnsi="Wingdings" w:hint="default"/>
+      </w:rPr>
+    </w:lvl>
+    <w:lvl w:ilvl="3" w:tplc="04160001" w:tentative="1">
+      <w:start w:val="1"/>
+      <w:numFmt w:val="bullet"/>
+      <w:lvlText w:val=""/>
+      <w:lvlJc w:val="left"/>
+      <w:pPr>
+        <w:ind w:left="2880" w:hanging="360"/>
+      </w:pPr>
+      <w:rPr>
+        <w:rFonts w:ascii="Symbol" w:hAnsi="Symbol" w:hint="default"/>
+      </w:rPr>
+    </w:lvl>
+    <w:lvl w:ilvl="4" w:tplc="04160003" w:tentative="1">
+      <w:start w:val="1"/>
+      <w:numFmt w:val="bullet"/>
+      <w:lvlText w:val="o"/>
+      <w:lvlJc w:val="left"/>
+      <w:pPr>
+        <w:ind w:left="3600" w:hanging="360"/>
+      </w:pPr>
+      <w:rPr>
+        <w:rFonts w:ascii="Courier New" w:hAnsi="Courier New" w:cs="Courier New" w:hint="default"/>
+      </w:rPr>
+    </w:lvl>
+    <w:lvl w:ilvl="5" w:tplc="04160005" w:tentative="1">
+      <w:start w:val="1"/>
+      <w:numFmt w:val="bullet"/>
+      <w:lvlText w:val=""/>
+      <w:lvlJc w:val="left"/>
+      <w:pPr>
+        <w:ind w:left="4320" w:hanging="360"/>
+      </w:pPr>
+      <w:rPr>
+        <w:rFonts w:ascii="Wingdings" w:hAnsi="Wingdings" w:hint="default"/>
+      </w:rPr>
+    </w:lvl>
+    <w:lvl w:ilvl="6" w:tplc="04160001" w:tentative="1">
+      <w:start w:val="1"/>
+      <w:numFmt w:val="bullet"/>
+      <w:lvlText w:val=""/>
+      <w:lvlJc w:val="left"/>
+      <w:pPr>
+        <w:ind w:left="5040" w:hanging="360"/>
+      </w:pPr>
+      <w:rPr>
+        <w:rFonts w:ascii="Symbol" w:hAnsi="Symbol" w:hint="default"/>
+      </w:rPr>
+    </w:lvl>
+    <w:lvl w:ilvl="7" w:tplc="04160003" w:tentative="1">
+      <w:start w:val="1"/>
+      <w:numFmt w:val="bullet"/>
+      <w:lvlText w:val="o"/>
+      <w:lvlJc w:val="left"/>
+      <w:pPr>
+        <w:ind w:left="5760" w:hanging="360"/>
+      </w:pPr>
+      <w:rPr>
+        <w:rFonts w:ascii="Courier New" w:hAnsi="Courier New" w:cs="Courier New" w:hint="default"/>
+      </w:rPr>
+    </w:lvl>
+    <w:lvl w:ilvl="8" w:tplc="04160005" w:tentative="1">
+      <w:start w:val="1"/>
+      <w:numFmt w:val="bullet"/>
+      <w:lvlText w:val=""/>
+      <w:lvlJc w:val="left"/>
+      <w:pPr>
+        <w:ind w:left="6480" w:hanging="360"/>
+      </w:pPr>
+      <w:rPr>
+        <w:rFonts w:ascii="Wingdings" w:hAnsi="Wingdings" w:hint="default"/>
+      </w:rPr>
+    </w:lvl>
+  </w:abstractNum>
+  <w:abstractNum w:abstractNumId="1" w15:restartNumberingAfterBreak="0">
+    <w:nsid w:val="3C4B3A35"/>
+    <w:multiLevelType w:val="hybridMultilevel"/>
+    <w:tmpl w:val="EC3C456C"/>
+    <w:lvl w:ilvl="0" w:tplc="04160001">
+      <w:start w:val="1"/>
+      <w:numFmt w:val="bullet"/>
+      <w:lvlText w:val=""/>
+      <w:lvlJc w:val="left"/>
+      <w:pPr>
+        <w:ind w:left="720" w:hanging="360"/>
+      </w:pPr>
+      <w:rPr>
+        <w:rFonts w:ascii="Symbol" w:hAnsi="Symbol" w:hint="default"/>
+      </w:rPr>
+    </w:lvl>
+    <w:lvl w:ilvl="1" w:tplc="04160003" w:tentative="1">
+      <w:start w:val="1"/>
+      <w:numFmt w:val="bullet"/>
+      <w:lvlText w:val="o"/>
+      <w:lvlJc w:val="left"/>
+      <w:pPr>
+        <w:ind w:left="1440" w:hanging="360"/>
+      </w:pPr>
+      <w:rPr>
+        <w:rFonts w:ascii="Courier New" w:hAnsi="Courier New" w:cs="Courier New" w:hint="default"/>
+      </w:rPr>
+    </w:lvl>
+    <w:lvl w:ilvl="2" w:tplc="04160005" w:tentative="1">
+      <w:start w:val="1"/>
+      <w:numFmt w:val="bullet"/>
+      <w:lvlText w:val=""/>
+      <w:lvlJc w:val="left"/>
+      <w:pPr>
+        <w:ind w:left="2160" w:hanging="360"/>
+      </w:pPr>
+      <w:rPr>
+        <w:rFonts w:ascii="Wingdings" w:hAnsi="Wingdings" w:hint="default"/>
+      </w:rPr>
+    </w:lvl>
+    <w:lvl w:ilvl="3" w:tplc="04160001" w:tentative="1">
+      <w:start w:val="1"/>
+      <w:numFmt w:val="bullet"/>
+      <w:lvlText w:val=""/>
+      <w:lvlJc w:val="left"/>
+      <w:pPr>
+        <w:ind w:left="2880" w:hanging="360"/>
+      </w:pPr>
+      <w:rPr>
+        <w:rFonts w:ascii="Symbol" w:hAnsi="Symbol" w:hint="default"/>
+      </w:rPr>
+    </w:lvl>
+    <w:lvl w:ilvl="4" w:tplc="04160003" w:tentative="1">
+      <w:start w:val="1"/>
+      <w:numFmt w:val="bullet"/>
+      <w:lvlText w:val="o"/>
+      <w:lvlJc w:val="left"/>
+      <w:pPr>
+        <w:ind w:left="3600" w:hanging="360"/>
+      </w:pPr>
+      <w:rPr>
+        <w:rFonts w:ascii="Courier New" w:hAnsi="Courier New" w:cs="Courier New" w:hint="default"/>
+      </w:rPr>
+    </w:lvl>
+    <w:lvl w:ilvl="5" w:tplc="04160005" w:tentative="1">
+      <w:start w:val="1"/>
+      <w:numFmt w:val="bullet"/>
+      <w:lvlText w:val=""/>
+      <w:lvlJc w:val="left"/>
+      <w:pPr>
+        <w:ind w:left="4320" w:hanging="360"/>
+      </w:pPr>
+      <w:rPr>
+        <w:rFonts w:ascii="Wingdings" w:hAnsi="Wingdings" w:hint="default"/>
+      </w:rPr>
+    </w:lvl>
+    <w:lvl w:ilvl="6" w:tplc="04160001" w:tentative="1">
+      <w:start w:val="1"/>
+      <w:numFmt w:val="bullet"/>
+      <w:lvlText w:val=""/>
+      <w:lvlJc w:val="left"/>
+      <w:pPr>
+        <w:ind w:left="5040" w:hanging="360"/>
+      </w:pPr>
+      <w:rPr>
+        <w:rFonts w:ascii="Symbol" w:hAnsi="Symbol" w:hint="default"/>
+      </w:rPr>
+    </w:lvl>
+    <w:lvl w:ilvl="7" w:tplc="04160003" w:tentative="1">
+      <w:start w:val="1"/>
+      <w:numFmt w:val="bullet"/>
+      <w:lvlText w:val="o"/>
+      <w:lvlJc w:val="left"/>
+      <w:pPr>
+        <w:ind w:left="5760" w:hanging="360"/>
+      </w:pPr>
+      <w:rPr>
+        <w:rFonts w:ascii="Courier New" w:hAnsi="Courier New" w:cs="Courier New" w:hint="default"/>
+      </w:rPr>
+    </w:lvl>
+    <w:lvl w:ilvl="8" w:tplc="04160005" w:tentative="1">
+      <w:start w:val="1"/>
+      <w:numFmt w:val="bullet"/>
+      <w:lvlText w:val=""/>
+      <w:lvlJc w:val="left"/>
+      <w:pPr>
+        <w:ind w:left="6480" w:hanging="360"/>
+      </w:pPr>
+      <w:rPr>
+        <w:rFonts w:ascii="Wingdings" w:hAnsi="Wingdings" w:hint="default"/>
+      </w:rPr>
+    </w:lvl>
+  </w:abstractNum>
+  <w:abstractNum w:abstractNumId="2" w15:restartNumberingAfterBreak="0">
     <w:nsid w:val="472F158E"/>
     <w:multiLevelType w:val="hybridMultilevel"/>
     <w:tmpl w:val="8548AA54"/>
@@ -428,8 +1165,130 @@
       </w:pPr>
     </w:lvl>
   </w:abstractNum>
+  <w:abstractNum w:abstractNumId="3" w15:restartNumberingAfterBreak="0">
+    <w:nsid w:val="65B51B9F"/>
+    <w:multiLevelType w:val="hybridMultilevel"/>
+    <w:tmpl w:val="A670A268"/>
+    <w:lvl w:ilvl="0" w:tplc="04160001">
+      <w:start w:val="1"/>
+      <w:numFmt w:val="bullet"/>
+      <w:lvlText w:val=""/>
+      <w:lvlJc w:val="left"/>
+      <w:pPr>
+        <w:ind w:left="720" w:hanging="360"/>
+      </w:pPr>
+      <w:rPr>
+        <w:rFonts w:ascii="Symbol" w:hAnsi="Symbol" w:hint="default"/>
+      </w:rPr>
+    </w:lvl>
+    <w:lvl w:ilvl="1" w:tplc="04160003" w:tentative="1">
+      <w:start w:val="1"/>
+      <w:numFmt w:val="bullet"/>
+      <w:lvlText w:val="o"/>
+      <w:lvlJc w:val="left"/>
+      <w:pPr>
+        <w:ind w:left="1440" w:hanging="360"/>
+      </w:pPr>
+      <w:rPr>
+        <w:rFonts w:ascii="Courier New" w:hAnsi="Courier New" w:cs="Courier New" w:hint="default"/>
+      </w:rPr>
+    </w:lvl>
+    <w:lvl w:ilvl="2" w:tplc="04160005" w:tentative="1">
+      <w:start w:val="1"/>
+      <w:numFmt w:val="bullet"/>
+      <w:lvlText w:val=""/>
+      <w:lvlJc w:val="left"/>
+      <w:pPr>
+        <w:ind w:left="2160" w:hanging="360"/>
+      </w:pPr>
+      <w:rPr>
+        <w:rFonts w:ascii="Wingdings" w:hAnsi="Wingdings" w:hint="default"/>
+      </w:rPr>
+    </w:lvl>
+    <w:lvl w:ilvl="3" w:tplc="04160001" w:tentative="1">
+      <w:start w:val="1"/>
+      <w:numFmt w:val="bullet"/>
+      <w:lvlText w:val=""/>
+      <w:lvlJc w:val="left"/>
+      <w:pPr>
+        <w:ind w:left="2880" w:hanging="360"/>
+      </w:pPr>
+      <w:rPr>
+        <w:rFonts w:ascii="Symbol" w:hAnsi="Symbol" w:hint="default"/>
+      </w:rPr>
+    </w:lvl>
+    <w:lvl w:ilvl="4" w:tplc="04160003" w:tentative="1">
+      <w:start w:val="1"/>
+      <w:numFmt w:val="bullet"/>
+      <w:lvlText w:val="o"/>
+      <w:lvlJc w:val="left"/>
+      <w:pPr>
+        <w:ind w:left="3600" w:hanging="360"/>
+      </w:pPr>
+      <w:rPr>
+        <w:rFonts w:ascii="Courier New" w:hAnsi="Courier New" w:cs="Courier New" w:hint="default"/>
+      </w:rPr>
+    </w:lvl>
+    <w:lvl w:ilvl="5" w:tplc="04160005" w:tentative="1">
+      <w:start w:val="1"/>
+      <w:numFmt w:val="bullet"/>
+      <w:lvlText w:val=""/>
+      <w:lvlJc w:val="left"/>
+      <w:pPr>
+        <w:ind w:left="4320" w:hanging="360"/>
+      </w:pPr>
+      <w:rPr>
+        <w:rFonts w:ascii="Wingdings" w:hAnsi="Wingdings" w:hint="default"/>
+      </w:rPr>
+    </w:lvl>
+    <w:lvl w:ilvl="6" w:tplc="04160001" w:tentative="1">
+      <w:start w:val="1"/>
+      <w:numFmt w:val="bullet"/>
+      <w:lvlText w:val=""/>
+      <w:lvlJc w:val="left"/>
+      <w:pPr>
+        <w:ind w:left="5040" w:hanging="360"/>
+      </w:pPr>
+      <w:rPr>
+        <w:rFonts w:ascii="Symbol" w:hAnsi="Symbol" w:hint="default"/>
+      </w:rPr>
+    </w:lvl>
+    <w:lvl w:ilvl="7" w:tplc="04160003" w:tentative="1">
+      <w:start w:val="1"/>
+      <w:numFmt w:val="bullet"/>
+      <w:lvlText w:val="o"/>
+      <w:lvlJc w:val="left"/>
+      <w:pPr>
+        <w:ind w:left="5760" w:hanging="360"/>
+      </w:pPr>
+      <w:rPr>
+        <w:rFonts w:ascii="Courier New" w:hAnsi="Courier New" w:cs="Courier New" w:hint="default"/>
+      </w:rPr>
+    </w:lvl>
+    <w:lvl w:ilvl="8" w:tplc="04160005" w:tentative="1">
+      <w:start w:val="1"/>
+      <w:numFmt w:val="bullet"/>
+      <w:lvlText w:val=""/>
+      <w:lvlJc w:val="left"/>
+      <w:pPr>
+        <w:ind w:left="6480" w:hanging="360"/>
+      </w:pPr>
+      <w:rPr>
+        <w:rFonts w:ascii="Wingdings" w:hAnsi="Wingdings" w:hint="default"/>
+      </w:rPr>
+    </w:lvl>
+  </w:abstractNum>
   <w:num w:numId="1" w16cid:durableId="251934955">
+    <w:abstractNumId w:val="2"/>
+  </w:num>
+  <w:num w:numId="2" w16cid:durableId="1189683503">
+    <w:abstractNumId w:val="1"/>
+  </w:num>
+  <w:num w:numId="3" w16cid:durableId="981545820">
     <w:abstractNumId w:val="0"/>
+  </w:num>
+  <w:num w:numId="4" w16cid:durableId="1500270295">
+    <w:abstractNumId w:val="3"/>
   </w:num>
 </w:numbering>
 </file>
@@ -439,19 +1298,11 @@
   <w:docDefaults>
     <w:rPrDefault>
       <w:rPr>
-        <w:rFonts w:asciiTheme="minorHAnsi" w:eastAsiaTheme="minorHAnsi" w:hAnsiTheme="minorHAnsi" w:cstheme="minorBidi"/>
-        <w:kern w:val="2"/>
-        <w:sz w:val="24"/>
-        <w:szCs w:val="24"/>
-        <w:lang w:val="pt-BR" w:eastAsia="en-US" w:bidi="ar-SA"/>
-        <w14:ligatures w14:val="standardContextual"/>
+        <w:rFonts w:ascii="Aptos" w:eastAsia="Aptos" w:hAnsi="Aptos" w:cs="Times New Roman"/>
+        <w:lang w:val="pt-BR" w:eastAsia="pt-BR" w:bidi="ar-SA"/>
       </w:rPr>
     </w:rPrDefault>
-    <w:pPrDefault>
-      <w:pPr>
-        <w:spacing w:after="160" w:line="278" w:lineRule="auto"/>
-      </w:pPr>
-    </w:pPrDefault>
+    <w:pPrDefault/>
   </w:docDefaults>
   <w:latentStyles w:defLockedState="0" w:defUIPriority="99" w:defSemiHidden="0" w:defUnhideWhenUsed="0" w:defQFormat="0" w:count="376">
     <w:lsdException w:name="Normal" w:uiPriority="0" w:qFormat="1"/>
@@ -834,6 +1685,15 @@
   <w:style w:type="paragraph" w:default="1" w:styleId="Normal">
     <w:name w:val="Normal"/>
     <w:qFormat/>
+    <w:pPr>
+      <w:spacing w:after="160" w:line="278" w:lineRule="auto"/>
+    </w:pPr>
+    <w:rPr>
+      <w:kern w:val="2"/>
+      <w:sz w:val="24"/>
+      <w:szCs w:val="24"/>
+      <w:lang w:eastAsia="en-US"/>
+    </w:rPr>
   </w:style>
   <w:style w:type="paragraph" w:styleId="Ttulo1">
     <w:name w:val="heading 1"/>
@@ -850,8 +1710,8 @@
       <w:outlineLvl w:val="0"/>
     </w:pPr>
     <w:rPr>
-      <w:rFonts w:asciiTheme="majorHAnsi" w:eastAsiaTheme="majorEastAsia" w:hAnsiTheme="majorHAnsi" w:cstheme="majorBidi"/>
-      <w:color w:val="0F4761" w:themeColor="accent1" w:themeShade="BF"/>
+      <w:rFonts w:ascii="Aptos Display" w:eastAsia="Times New Roman" w:hAnsi="Aptos Display"/>
+      <w:color w:val="0F4761"/>
       <w:sz w:val="40"/>
       <w:szCs w:val="40"/>
     </w:rPr>
@@ -873,8 +1733,8 @@
       <w:outlineLvl w:val="1"/>
     </w:pPr>
     <w:rPr>
-      <w:rFonts w:asciiTheme="majorHAnsi" w:eastAsiaTheme="majorEastAsia" w:hAnsiTheme="majorHAnsi" w:cstheme="majorBidi"/>
-      <w:color w:val="0F4761" w:themeColor="accent1" w:themeShade="BF"/>
+      <w:rFonts w:ascii="Aptos Display" w:eastAsia="Times New Roman" w:hAnsi="Aptos Display"/>
+      <w:color w:val="0F4761"/>
       <w:sz w:val="32"/>
       <w:szCs w:val="32"/>
     </w:rPr>
@@ -896,8 +1756,8 @@
       <w:outlineLvl w:val="2"/>
     </w:pPr>
     <w:rPr>
-      <w:rFonts w:eastAsiaTheme="majorEastAsia" w:cstheme="majorBidi"/>
-      <w:color w:val="0F4761" w:themeColor="accent1" w:themeShade="BF"/>
+      <w:rFonts w:eastAsia="Times New Roman"/>
+      <w:color w:val="0F4761"/>
       <w:sz w:val="28"/>
       <w:szCs w:val="28"/>
     </w:rPr>
@@ -919,10 +1779,10 @@
       <w:outlineLvl w:val="3"/>
     </w:pPr>
     <w:rPr>
-      <w:rFonts w:eastAsiaTheme="majorEastAsia" w:cstheme="majorBidi"/>
+      <w:rFonts w:eastAsia="Times New Roman"/>
       <w:i/>
       <w:iCs/>
-      <w:color w:val="0F4761" w:themeColor="accent1" w:themeShade="BF"/>
+      <w:color w:val="0F4761"/>
     </w:rPr>
   </w:style>
   <w:style w:type="paragraph" w:styleId="Ttulo5">
@@ -942,8 +1802,8 @@
       <w:outlineLvl w:val="4"/>
     </w:pPr>
     <w:rPr>
-      <w:rFonts w:eastAsiaTheme="majorEastAsia" w:cstheme="majorBidi"/>
-      <w:color w:val="0F4761" w:themeColor="accent1" w:themeShade="BF"/>
+      <w:rFonts w:eastAsia="Times New Roman"/>
+      <w:color w:val="0F4761"/>
     </w:rPr>
   </w:style>
   <w:style w:type="paragraph" w:styleId="Ttulo6">
@@ -963,10 +1823,10 @@
       <w:outlineLvl w:val="5"/>
     </w:pPr>
     <w:rPr>
-      <w:rFonts w:eastAsiaTheme="majorEastAsia" w:cstheme="majorBidi"/>
+      <w:rFonts w:eastAsia="Times New Roman"/>
       <w:i/>
       <w:iCs/>
-      <w:color w:val="595959" w:themeColor="text1" w:themeTint="A6"/>
+      <w:color w:val="595959"/>
     </w:rPr>
   </w:style>
   <w:style w:type="paragraph" w:styleId="Ttulo7">
@@ -986,8 +1846,8 @@
       <w:outlineLvl w:val="6"/>
     </w:pPr>
     <w:rPr>
-      <w:rFonts w:eastAsiaTheme="majorEastAsia" w:cstheme="majorBidi"/>
-      <w:color w:val="595959" w:themeColor="text1" w:themeTint="A6"/>
+      <w:rFonts w:eastAsia="Times New Roman"/>
+      <w:color w:val="595959"/>
     </w:rPr>
   </w:style>
   <w:style w:type="paragraph" w:styleId="Ttulo8">
@@ -1007,10 +1867,10 @@
       <w:outlineLvl w:val="7"/>
     </w:pPr>
     <w:rPr>
-      <w:rFonts w:eastAsiaTheme="majorEastAsia" w:cstheme="majorBidi"/>
+      <w:rFonts w:eastAsia="Times New Roman"/>
       <w:i/>
       <w:iCs/>
-      <w:color w:val="272727" w:themeColor="text1" w:themeTint="D8"/>
+      <w:color w:val="272727"/>
     </w:rPr>
   </w:style>
   <w:style w:type="paragraph" w:styleId="Ttulo9">
@@ -1030,8 +1890,8 @@
       <w:outlineLvl w:val="8"/>
     </w:pPr>
     <w:rPr>
-      <w:rFonts w:eastAsiaTheme="majorEastAsia" w:cstheme="majorBidi"/>
-      <w:color w:val="272727" w:themeColor="text1" w:themeTint="D8"/>
+      <w:rFonts w:eastAsia="Times New Roman"/>
+      <w:color w:val="272727"/>
     </w:rPr>
   </w:style>
   <w:style w:type="character" w:default="1" w:styleId="Fontepargpadro">
@@ -1062,121 +1922,112 @@
   </w:style>
   <w:style w:type="character" w:customStyle="1" w:styleId="Ttulo1Char">
     <w:name w:val="Título 1 Char"/>
-    <w:basedOn w:val="Fontepargpadro"/>
     <w:link w:val="Ttulo1"/>
     <w:uiPriority w:val="9"/>
     <w:rsid w:val="000B07E2"/>
     <w:rPr>
-      <w:rFonts w:asciiTheme="majorHAnsi" w:eastAsiaTheme="majorEastAsia" w:hAnsiTheme="majorHAnsi" w:cstheme="majorBidi"/>
-      <w:color w:val="0F4761" w:themeColor="accent1" w:themeShade="BF"/>
+      <w:rFonts w:ascii="Aptos Display" w:eastAsia="Times New Roman" w:hAnsi="Aptos Display" w:cs="Times New Roman"/>
+      <w:color w:val="0F4761"/>
       <w:sz w:val="40"/>
       <w:szCs w:val="40"/>
     </w:rPr>
   </w:style>
   <w:style w:type="character" w:customStyle="1" w:styleId="Ttulo2Char">
     <w:name w:val="Título 2 Char"/>
-    <w:basedOn w:val="Fontepargpadro"/>
     <w:link w:val="Ttulo2"/>
     <w:uiPriority w:val="9"/>
     <w:semiHidden/>
     <w:rsid w:val="000B07E2"/>
     <w:rPr>
-      <w:rFonts w:asciiTheme="majorHAnsi" w:eastAsiaTheme="majorEastAsia" w:hAnsiTheme="majorHAnsi" w:cstheme="majorBidi"/>
-      <w:color w:val="0F4761" w:themeColor="accent1" w:themeShade="BF"/>
+      <w:rFonts w:ascii="Aptos Display" w:eastAsia="Times New Roman" w:hAnsi="Aptos Display" w:cs="Times New Roman"/>
+      <w:color w:val="0F4761"/>
       <w:sz w:val="32"/>
       <w:szCs w:val="32"/>
     </w:rPr>
   </w:style>
   <w:style w:type="character" w:customStyle="1" w:styleId="Ttulo3Char">
     <w:name w:val="Título 3 Char"/>
-    <w:basedOn w:val="Fontepargpadro"/>
     <w:link w:val="Ttulo3"/>
     <w:uiPriority w:val="9"/>
     <w:semiHidden/>
     <w:rsid w:val="000B07E2"/>
     <w:rPr>
-      <w:rFonts w:eastAsiaTheme="majorEastAsia" w:cstheme="majorBidi"/>
-      <w:color w:val="0F4761" w:themeColor="accent1" w:themeShade="BF"/>
+      <w:rFonts w:eastAsia="Times New Roman" w:cs="Times New Roman"/>
+      <w:color w:val="0F4761"/>
       <w:sz w:val="28"/>
       <w:szCs w:val="28"/>
     </w:rPr>
   </w:style>
   <w:style w:type="character" w:customStyle="1" w:styleId="Ttulo4Char">
     <w:name w:val="Título 4 Char"/>
-    <w:basedOn w:val="Fontepargpadro"/>
     <w:link w:val="Ttulo4"/>
     <w:uiPriority w:val="9"/>
     <w:semiHidden/>
     <w:rsid w:val="000B07E2"/>
     <w:rPr>
-      <w:rFonts w:eastAsiaTheme="majorEastAsia" w:cstheme="majorBidi"/>
+      <w:rFonts w:eastAsia="Times New Roman" w:cs="Times New Roman"/>
       <w:i/>
       <w:iCs/>
-      <w:color w:val="0F4761" w:themeColor="accent1" w:themeShade="BF"/>
+      <w:color w:val="0F4761"/>
     </w:rPr>
   </w:style>
   <w:style w:type="character" w:customStyle="1" w:styleId="Ttulo5Char">
     <w:name w:val="Título 5 Char"/>
-    <w:basedOn w:val="Fontepargpadro"/>
     <w:link w:val="Ttulo5"/>
     <w:uiPriority w:val="9"/>
     <w:semiHidden/>
     <w:rsid w:val="000B07E2"/>
     <w:rPr>
-      <w:rFonts w:eastAsiaTheme="majorEastAsia" w:cstheme="majorBidi"/>
-      <w:color w:val="0F4761" w:themeColor="accent1" w:themeShade="BF"/>
+      <w:rFonts w:eastAsia="Times New Roman" w:cs="Times New Roman"/>
+      <w:color w:val="0F4761"/>
     </w:rPr>
   </w:style>
   <w:style w:type="character" w:customStyle="1" w:styleId="Ttulo6Char">
     <w:name w:val="Título 6 Char"/>
-    <w:basedOn w:val="Fontepargpadro"/>
     <w:link w:val="Ttulo6"/>
     <w:uiPriority w:val="9"/>
     <w:semiHidden/>
     <w:rsid w:val="000B07E2"/>
     <w:rPr>
-      <w:rFonts w:eastAsiaTheme="majorEastAsia" w:cstheme="majorBidi"/>
+      <w:rFonts w:eastAsia="Times New Roman" w:cs="Times New Roman"/>
       <w:i/>
       <w:iCs/>
-      <w:color w:val="595959" w:themeColor="text1" w:themeTint="A6"/>
+      <w:color w:val="595959"/>
     </w:rPr>
   </w:style>
   <w:style w:type="character" w:customStyle="1" w:styleId="Ttulo7Char">
     <w:name w:val="Título 7 Char"/>
-    <w:basedOn w:val="Fontepargpadro"/>
     <w:link w:val="Ttulo7"/>
     <w:uiPriority w:val="9"/>
     <w:semiHidden/>
     <w:rsid w:val="000B07E2"/>
     <w:rPr>
-      <w:rFonts w:eastAsiaTheme="majorEastAsia" w:cstheme="majorBidi"/>
-      <w:color w:val="595959" w:themeColor="text1" w:themeTint="A6"/>
+      <w:rFonts w:eastAsia="Times New Roman" w:cs="Times New Roman"/>
+      <w:color w:val="595959"/>
     </w:rPr>
   </w:style>
   <w:style w:type="character" w:customStyle="1" w:styleId="Ttulo8Char">
     <w:name w:val="Título 8 Char"/>
-    <w:basedOn w:val="Fontepargpadro"/>
     <w:link w:val="Ttulo8"/>
     <w:uiPriority w:val="9"/>
     <w:semiHidden/>
     <w:rsid w:val="000B07E2"/>
     <w:rPr>
-      <w:rFonts w:eastAsiaTheme="majorEastAsia" w:cstheme="majorBidi"/>
+      <w:rFonts w:eastAsia="Times New Roman" w:cs="Times New Roman"/>
       <w:i/>
       <w:iCs/>
-      <w:color w:val="272727" w:themeColor="text1" w:themeTint="D8"/>
+      <w:color w:val="272727"/>
     </w:rPr>
   </w:style>
   <w:style w:type="character" w:customStyle="1" w:styleId="Ttulo9Char">
     <w:name w:val="Título 9 Char"/>
-    <w:basedOn w:val="Fontepargpadro"/>
     <w:link w:val="Ttulo9"/>
     <w:uiPriority w:val="9"/>
     <w:semiHidden/>
     <w:rsid w:val="000B07E2"/>
     <w:rPr>
-      <w:rFonts w:eastAsiaTheme="majorEastAsia" w:cstheme="majorBidi"/>
-      <w:color w:val="272727" w:themeColor="text1" w:themeTint="D8"/>
+      <w:rFonts w:eastAsia="Times New Roman" w:cs="Times New Roman"/>
+      <w:color w:val="272727"/>
     </w:rPr>
   </w:style>
   <w:style w:type="paragraph" w:styleId="Ttulo">
@@ -1192,7 +2043,7 @@
       <w:contextualSpacing/>
     </w:pPr>
     <w:rPr>
-      <w:rFonts w:asciiTheme="majorHAnsi" w:eastAsiaTheme="majorEastAsia" w:hAnsiTheme="majorHAnsi" w:cstheme="majorBidi"/>
+      <w:rFonts w:ascii="Aptos Display" w:eastAsia="Times New Roman" w:hAnsi="Aptos Display"/>
       <w:spacing w:val="-10"/>
       <w:kern w:val="28"/>
       <w:sz w:val="56"/>
@@ -1201,12 +2052,11 @@
   </w:style>
   <w:style w:type="character" w:customStyle="1" w:styleId="TtuloChar">
     <w:name w:val="Título Char"/>
-    <w:basedOn w:val="Fontepargpadro"/>
     <w:link w:val="Ttulo"/>
     <w:uiPriority w:val="10"/>
     <w:rsid w:val="000B07E2"/>
     <w:rPr>
-      <w:rFonts w:asciiTheme="majorHAnsi" w:eastAsiaTheme="majorEastAsia" w:hAnsiTheme="majorHAnsi" w:cstheme="majorBidi"/>
+      <w:rFonts w:ascii="Aptos Display" w:eastAsia="Times New Roman" w:hAnsi="Aptos Display" w:cs="Times New Roman"/>
       <w:spacing w:val="-10"/>
       <w:kern w:val="28"/>
       <w:sz w:val="56"/>
@@ -1227,8 +2077,8 @@
       </w:numPr>
     </w:pPr>
     <w:rPr>
-      <w:rFonts w:eastAsiaTheme="majorEastAsia" w:cstheme="majorBidi"/>
-      <w:color w:val="595959" w:themeColor="text1" w:themeTint="A6"/>
+      <w:rFonts w:eastAsia="Times New Roman"/>
+      <w:color w:val="595959"/>
       <w:spacing w:val="15"/>
       <w:sz w:val="28"/>
       <w:szCs w:val="28"/>
@@ -1236,13 +2086,12 @@
   </w:style>
   <w:style w:type="character" w:customStyle="1" w:styleId="SubttuloChar">
     <w:name w:val="Subtítulo Char"/>
-    <w:basedOn w:val="Fontepargpadro"/>
     <w:link w:val="Subttulo"/>
     <w:uiPriority w:val="11"/>
     <w:rsid w:val="000B07E2"/>
     <w:rPr>
-      <w:rFonts w:eastAsiaTheme="majorEastAsia" w:cstheme="majorBidi"/>
-      <w:color w:val="595959" w:themeColor="text1" w:themeTint="A6"/>
+      <w:rFonts w:eastAsia="Times New Roman" w:cs="Times New Roman"/>
+      <w:color w:val="595959"/>
       <w:spacing w:val="15"/>
       <w:sz w:val="28"/>
       <w:szCs w:val="28"/>
@@ -1263,19 +2112,18 @@
     <w:rPr>
       <w:i/>
       <w:iCs/>
-      <w:color w:val="404040" w:themeColor="text1" w:themeTint="BF"/>
+      <w:color w:val="404040"/>
     </w:rPr>
   </w:style>
   <w:style w:type="character" w:customStyle="1" w:styleId="CitaoChar">
     <w:name w:val="Citação Char"/>
-    <w:basedOn w:val="Fontepargpadro"/>
     <w:link w:val="Citao"/>
     <w:uiPriority w:val="29"/>
     <w:rsid w:val="000B07E2"/>
     <w:rPr>
       <w:i/>
       <w:iCs/>
-      <w:color w:val="404040" w:themeColor="text1" w:themeTint="BF"/>
+      <w:color w:val="404040"/>
     </w:rPr>
   </w:style>
   <w:style w:type="paragraph" w:styleId="PargrafodaLista">
@@ -1291,14 +2139,13 @@
   </w:style>
   <w:style w:type="character" w:styleId="nfaseIntensa">
     <w:name w:val="Intense Emphasis"/>
-    <w:basedOn w:val="Fontepargpadro"/>
     <w:uiPriority w:val="21"/>
     <w:qFormat/>
     <w:rsid w:val="000B07E2"/>
     <w:rPr>
       <w:i/>
       <w:iCs/>
-      <w:color w:val="0F4761" w:themeColor="accent1" w:themeShade="BF"/>
+      <w:color w:val="0F4761"/>
     </w:rPr>
   </w:style>
   <w:style w:type="paragraph" w:styleId="CitaoIntensa">
@@ -1311,8 +2158,8 @@
     <w:rsid w:val="000B07E2"/>
     <w:pPr>
       <w:pBdr>
-        <w:top w:val="single" w:sz="4" w:space="10" w:color="0F4761" w:themeColor="accent1" w:themeShade="BF"/>
-        <w:bottom w:val="single" w:sz="4" w:space="10" w:color="0F4761" w:themeColor="accent1" w:themeShade="BF"/>
+        <w:top w:val="single" w:sz="4" w:space="10" w:color="0F4761"/>
+        <w:bottom w:val="single" w:sz="4" w:space="10" w:color="0F4761"/>
       </w:pBdr>
       <w:spacing w:before="360" w:after="360"/>
       <w:ind w:left="864" w:right="864"/>
@@ -1321,24 +2168,22 @@
     <w:rPr>
       <w:i/>
       <w:iCs/>
-      <w:color w:val="0F4761" w:themeColor="accent1" w:themeShade="BF"/>
+      <w:color w:val="0F4761"/>
     </w:rPr>
   </w:style>
   <w:style w:type="character" w:customStyle="1" w:styleId="CitaoIntensaChar">
     <w:name w:val="Citação Intensa Char"/>
-    <w:basedOn w:val="Fontepargpadro"/>
     <w:link w:val="CitaoIntensa"/>
     <w:uiPriority w:val="30"/>
     <w:rsid w:val="000B07E2"/>
     <w:rPr>
       <w:i/>
       <w:iCs/>
-      <w:color w:val="0F4761" w:themeColor="accent1" w:themeShade="BF"/>
+      <w:color w:val="0F4761"/>
     </w:rPr>
   </w:style>
   <w:style w:type="character" w:styleId="RefernciaIntensa">
     <w:name w:val="Intense Reference"/>
-    <w:basedOn w:val="Fontepargpadro"/>
     <w:uiPriority w:val="32"/>
     <w:qFormat/>
     <w:rsid w:val="000B07E2"/>
@@ -1346,24 +2191,22 @@
       <w:b/>
       <w:bCs/>
       <w:smallCaps/>
-      <w:color w:val="0F4761" w:themeColor="accent1" w:themeShade="BF"/>
+      <w:color w:val="0F4761"/>
       <w:spacing w:val="5"/>
     </w:rPr>
   </w:style>
   <w:style w:type="character" w:styleId="Hyperlink">
     <w:name w:val="Hyperlink"/>
-    <w:basedOn w:val="Fontepargpadro"/>
     <w:uiPriority w:val="99"/>
     <w:unhideWhenUsed/>
     <w:rsid w:val="009323FE"/>
     <w:rPr>
-      <w:color w:val="467886" w:themeColor="hyperlink"/>
+      <w:color w:val="467886"/>
       <w:u w:val="single"/>
     </w:rPr>
   </w:style>
   <w:style w:type="character" w:styleId="MenoPendente">
     <w:name w:val="Unresolved Mention"/>
-    <w:basedOn w:val="Fontepargpadro"/>
     <w:uiPriority w:val="99"/>
     <w:semiHidden/>
     <w:unhideWhenUsed/>
@@ -1375,13 +2218,12 @@
   </w:style>
   <w:style w:type="character" w:styleId="HiperlinkVisitado">
     <w:name w:val="FollowedHyperlink"/>
-    <w:basedOn w:val="Fontepargpadro"/>
     <w:uiPriority w:val="99"/>
     <w:semiHidden/>
     <w:unhideWhenUsed/>
     <w:rsid w:val="009323FE"/>
     <w:rPr>
-      <w:color w:val="96607D" w:themeColor="followedHyperlink"/>
+      <w:color w:val="96607D"/>
       <w:u w:val="single"/>
     </w:rPr>
   </w:style>

</xml_diff>